<commit_message>
vault backup: 2025-12-24 12:26:12
</commit_message>
<xml_diff>
--- a/Bible Reading Plans/Integrated Bible Reading Plan - 1 y 5 d/Integrated_Bible_Reading_Plan - Checklist.docx
+++ b/Bible Reading Plans/Integrated Bible Reading Plan - 1 y 5 d/Integrated_Bible_Reading_Plan - Checklist.docx
@@ -383,6 +383,7 @@
         <w:pStyle w:val="Heading2"/>
       </w:pPr>
       <w:bookmarkStart w:id="4" w:name="exodus"/>
+      <w:bookmarkStart w:id="5" w:name="_Hlk217317112"/>
       <w:r>
         <w:t>Exodus</w:t>
       </w:r>
@@ -551,7 +552,7 @@
       <w:pPr>
         <w:pStyle w:val="Heading2"/>
       </w:pPr>
-      <w:bookmarkStart w:id="5" w:name="leviticus"/>
+      <w:bookmarkStart w:id="6" w:name="leviticus"/>
       <w:bookmarkEnd w:id="4"/>
       <w:r>
         <w:t>Leviticus</w:t>
@@ -661,315 +662,317 @@
       <w:pPr>
         <w:pStyle w:val="Heading2"/>
       </w:pPr>
-      <w:bookmarkStart w:id="6" w:name="numbers"/>
+      <w:bookmarkStart w:id="7" w:name="numbers"/>
+      <w:bookmarkEnd w:id="6"/>
+      <w:r>
+        <w:t>Numbers</w:t>
+      </w:r>
+    </w:p>
+    <w:p>
+      <w:pPr>
+        <w:pStyle w:val="Compact"/>
+        <w:numPr>
+          <w:ilvl w:val="0"/>
+          <w:numId w:val="1"/>
+        </w:numPr>
+        <w:rPr>
+          <w:sz w:val="18"/>
+          <w:szCs w:val="22"/>
+        </w:rPr>
+      </w:pPr>
+      <w:r>
+        <w:rPr>
+          <w:sz w:val="18"/>
+          <w:szCs w:val="22"/>
+        </w:rPr>
+        <w:t>Day 1: Numbers 1–4</w:t>
+      </w:r>
+    </w:p>
+    <w:p>
+      <w:pPr>
+        <w:pStyle w:val="Compact"/>
+        <w:numPr>
+          <w:ilvl w:val="0"/>
+          <w:numId w:val="1"/>
+        </w:numPr>
+        <w:rPr>
+          <w:sz w:val="18"/>
+          <w:szCs w:val="22"/>
+        </w:rPr>
+      </w:pPr>
+      <w:r>
+        <w:rPr>
+          <w:sz w:val="18"/>
+          <w:szCs w:val="22"/>
+        </w:rPr>
+        <w:t>Day 2: Numbers 5–9</w:t>
+      </w:r>
+    </w:p>
+    <w:p>
+      <w:pPr>
+        <w:pStyle w:val="Compact"/>
+        <w:numPr>
+          <w:ilvl w:val="0"/>
+          <w:numId w:val="1"/>
+        </w:numPr>
+        <w:rPr>
+          <w:sz w:val="18"/>
+          <w:szCs w:val="22"/>
+        </w:rPr>
+      </w:pPr>
+      <w:r>
+        <w:rPr>
+          <w:sz w:val="18"/>
+          <w:szCs w:val="22"/>
+        </w:rPr>
+        <w:t>Day 3: Numbers 10–14</w:t>
+      </w:r>
+    </w:p>
+    <w:p>
+      <w:pPr>
+        <w:pStyle w:val="Compact"/>
+        <w:numPr>
+          <w:ilvl w:val="0"/>
+          <w:numId w:val="1"/>
+        </w:numPr>
+        <w:rPr>
+          <w:sz w:val="18"/>
+          <w:szCs w:val="22"/>
+        </w:rPr>
+      </w:pPr>
+      <w:r>
+        <w:rPr>
+          <w:sz w:val="18"/>
+          <w:szCs w:val="22"/>
+        </w:rPr>
+        <w:t>Day 4: Numbers 15–19</w:t>
+      </w:r>
+    </w:p>
+    <w:p>
+      <w:pPr>
+        <w:pStyle w:val="Compact"/>
+        <w:numPr>
+          <w:ilvl w:val="0"/>
+          <w:numId w:val="1"/>
+        </w:numPr>
+        <w:rPr>
+          <w:sz w:val="18"/>
+          <w:szCs w:val="22"/>
+        </w:rPr>
+      </w:pPr>
+      <w:r>
+        <w:rPr>
+          <w:sz w:val="18"/>
+          <w:szCs w:val="22"/>
+        </w:rPr>
+        <w:t>Day 5: Numbers 20–24</w:t>
+      </w:r>
+    </w:p>
+    <w:p>
+      <w:pPr>
+        <w:pStyle w:val="Compact"/>
+        <w:numPr>
+          <w:ilvl w:val="0"/>
+          <w:numId w:val="1"/>
+        </w:numPr>
+        <w:rPr>
+          <w:sz w:val="18"/>
+          <w:szCs w:val="22"/>
+        </w:rPr>
+      </w:pPr>
+      <w:r>
+        <w:rPr>
+          <w:sz w:val="18"/>
+          <w:szCs w:val="22"/>
+        </w:rPr>
+        <w:t>Day 6: Numbers 25–29</w:t>
+      </w:r>
+    </w:p>
+    <w:p>
+      <w:pPr>
+        <w:pStyle w:val="Compact"/>
+        <w:numPr>
+          <w:ilvl w:val="0"/>
+          <w:numId w:val="1"/>
+        </w:numPr>
+        <w:rPr>
+          <w:sz w:val="18"/>
+          <w:szCs w:val="22"/>
+        </w:rPr>
+      </w:pPr>
+      <w:r>
+        <w:rPr>
+          <w:sz w:val="18"/>
+          <w:szCs w:val="22"/>
+        </w:rPr>
+        <w:t>Day 7: Numbers 30–33</w:t>
+      </w:r>
+    </w:p>
+    <w:p>
+      <w:pPr>
+        <w:pStyle w:val="Compact"/>
+        <w:numPr>
+          <w:ilvl w:val="0"/>
+          <w:numId w:val="1"/>
+        </w:numPr>
+        <w:rPr>
+          <w:sz w:val="18"/>
+          <w:szCs w:val="22"/>
+        </w:rPr>
+      </w:pPr>
+      <w:r>
+        <w:rPr>
+          <w:sz w:val="18"/>
+          <w:szCs w:val="22"/>
+        </w:rPr>
+        <w:t>Day 8: Numbers 34–36</w:t>
+      </w:r>
+    </w:p>
+    <w:p>
+      <w:pPr>
+        <w:pStyle w:val="Heading2"/>
+      </w:pPr>
+      <w:bookmarkStart w:id="8" w:name="deuteronomy"/>
+      <w:bookmarkEnd w:id="7"/>
+      <w:r>
+        <w:t>Deuteronomy</w:t>
+      </w:r>
+    </w:p>
+    <w:p>
+      <w:pPr>
+        <w:pStyle w:val="Compact"/>
+        <w:numPr>
+          <w:ilvl w:val="0"/>
+          <w:numId w:val="1"/>
+        </w:numPr>
+        <w:rPr>
+          <w:sz w:val="18"/>
+          <w:szCs w:val="22"/>
+        </w:rPr>
+      </w:pPr>
+      <w:r>
+        <w:rPr>
+          <w:sz w:val="18"/>
+          <w:szCs w:val="22"/>
+        </w:rPr>
+        <w:t>Day 1: Deuteronomy 1–5</w:t>
+      </w:r>
+    </w:p>
+    <w:p>
+      <w:pPr>
+        <w:pStyle w:val="Compact"/>
+        <w:numPr>
+          <w:ilvl w:val="0"/>
+          <w:numId w:val="1"/>
+        </w:numPr>
+        <w:rPr>
+          <w:sz w:val="18"/>
+          <w:szCs w:val="22"/>
+        </w:rPr>
+      </w:pPr>
+      <w:r>
+        <w:rPr>
+          <w:sz w:val="18"/>
+          <w:szCs w:val="22"/>
+        </w:rPr>
+        <w:t>Day 2: Deuteronomy 6–10</w:t>
+      </w:r>
+    </w:p>
+    <w:p>
+      <w:pPr>
+        <w:pStyle w:val="Compact"/>
+        <w:numPr>
+          <w:ilvl w:val="0"/>
+          <w:numId w:val="1"/>
+        </w:numPr>
+        <w:rPr>
+          <w:sz w:val="18"/>
+          <w:szCs w:val="22"/>
+        </w:rPr>
+      </w:pPr>
+      <w:r>
+        <w:rPr>
+          <w:sz w:val="18"/>
+          <w:szCs w:val="22"/>
+        </w:rPr>
+        <w:t>Day 3: Deuteronomy 11–15</w:t>
+      </w:r>
+    </w:p>
+    <w:p>
+      <w:pPr>
+        <w:pStyle w:val="Compact"/>
+        <w:numPr>
+          <w:ilvl w:val="0"/>
+          <w:numId w:val="1"/>
+        </w:numPr>
+        <w:rPr>
+          <w:sz w:val="18"/>
+          <w:szCs w:val="22"/>
+        </w:rPr>
+      </w:pPr>
+      <w:r>
+        <w:rPr>
+          <w:sz w:val="18"/>
+          <w:szCs w:val="22"/>
+        </w:rPr>
+        <w:t>Day 4: Deuteronomy 16–20</w:t>
+      </w:r>
+    </w:p>
+    <w:p>
+      <w:pPr>
+        <w:pStyle w:val="Compact"/>
+        <w:numPr>
+          <w:ilvl w:val="0"/>
+          <w:numId w:val="1"/>
+        </w:numPr>
+        <w:rPr>
+          <w:sz w:val="18"/>
+          <w:szCs w:val="22"/>
+        </w:rPr>
+      </w:pPr>
+      <w:r>
+        <w:rPr>
+          <w:sz w:val="18"/>
+          <w:szCs w:val="22"/>
+        </w:rPr>
+        <w:t>Day 5: Deuteronomy 21–25</w:t>
+      </w:r>
+    </w:p>
+    <w:p>
+      <w:pPr>
+        <w:pStyle w:val="Compact"/>
+        <w:numPr>
+          <w:ilvl w:val="0"/>
+          <w:numId w:val="1"/>
+        </w:numPr>
+        <w:rPr>
+          <w:sz w:val="18"/>
+          <w:szCs w:val="22"/>
+        </w:rPr>
+      </w:pPr>
+      <w:r>
+        <w:rPr>
+          <w:sz w:val="18"/>
+          <w:szCs w:val="22"/>
+        </w:rPr>
+        <w:t>Day 6: Deuteronomy 26–30</w:t>
+      </w:r>
+    </w:p>
+    <w:p>
+      <w:pPr>
+        <w:pStyle w:val="Compact"/>
+        <w:numPr>
+          <w:ilvl w:val="0"/>
+          <w:numId w:val="1"/>
+        </w:numPr>
+        <w:rPr>
+          <w:sz w:val="18"/>
+          <w:szCs w:val="22"/>
+        </w:rPr>
+      </w:pPr>
+      <w:bookmarkStart w:id="9" w:name="_Hlk217317124"/>
       <w:bookmarkEnd w:id="5"/>
       <w:r>
-        <w:t>Numbers</w:t>
-      </w:r>
-    </w:p>
-    <w:p>
-      <w:pPr>
-        <w:pStyle w:val="Compact"/>
-        <w:numPr>
-          <w:ilvl w:val="0"/>
-          <w:numId w:val="1"/>
-        </w:numPr>
-        <w:rPr>
-          <w:sz w:val="18"/>
-          <w:szCs w:val="22"/>
-        </w:rPr>
-      </w:pPr>
-      <w:r>
-        <w:rPr>
-          <w:sz w:val="18"/>
-          <w:szCs w:val="22"/>
-        </w:rPr>
-        <w:t>Day 1: Numbers 1–4</w:t>
-      </w:r>
-    </w:p>
-    <w:p>
-      <w:pPr>
-        <w:pStyle w:val="Compact"/>
-        <w:numPr>
-          <w:ilvl w:val="0"/>
-          <w:numId w:val="1"/>
-        </w:numPr>
-        <w:rPr>
-          <w:sz w:val="18"/>
-          <w:szCs w:val="22"/>
-        </w:rPr>
-      </w:pPr>
-      <w:r>
-        <w:rPr>
-          <w:sz w:val="18"/>
-          <w:szCs w:val="22"/>
-        </w:rPr>
-        <w:t>Day 2: Numbers 5–9</w:t>
-      </w:r>
-    </w:p>
-    <w:p>
-      <w:pPr>
-        <w:pStyle w:val="Compact"/>
-        <w:numPr>
-          <w:ilvl w:val="0"/>
-          <w:numId w:val="1"/>
-        </w:numPr>
-        <w:rPr>
-          <w:sz w:val="18"/>
-          <w:szCs w:val="22"/>
-        </w:rPr>
-      </w:pPr>
-      <w:r>
-        <w:rPr>
-          <w:sz w:val="18"/>
-          <w:szCs w:val="22"/>
-        </w:rPr>
-        <w:t>Day 3: Numbers 10–14</w:t>
-      </w:r>
-    </w:p>
-    <w:p>
-      <w:pPr>
-        <w:pStyle w:val="Compact"/>
-        <w:numPr>
-          <w:ilvl w:val="0"/>
-          <w:numId w:val="1"/>
-        </w:numPr>
-        <w:rPr>
-          <w:sz w:val="18"/>
-          <w:szCs w:val="22"/>
-        </w:rPr>
-      </w:pPr>
-      <w:r>
-        <w:rPr>
-          <w:sz w:val="18"/>
-          <w:szCs w:val="22"/>
-        </w:rPr>
-        <w:t>Day 4: Numbers 15–19</w:t>
-      </w:r>
-    </w:p>
-    <w:p>
-      <w:pPr>
-        <w:pStyle w:val="Compact"/>
-        <w:numPr>
-          <w:ilvl w:val="0"/>
-          <w:numId w:val="1"/>
-        </w:numPr>
-        <w:rPr>
-          <w:sz w:val="18"/>
-          <w:szCs w:val="22"/>
-        </w:rPr>
-      </w:pPr>
-      <w:r>
-        <w:rPr>
-          <w:sz w:val="18"/>
-          <w:szCs w:val="22"/>
-        </w:rPr>
-        <w:t>Day 5: Numbers 20–24</w:t>
-      </w:r>
-    </w:p>
-    <w:p>
-      <w:pPr>
-        <w:pStyle w:val="Compact"/>
-        <w:numPr>
-          <w:ilvl w:val="0"/>
-          <w:numId w:val="1"/>
-        </w:numPr>
-        <w:rPr>
-          <w:sz w:val="18"/>
-          <w:szCs w:val="22"/>
-        </w:rPr>
-      </w:pPr>
-      <w:r>
-        <w:rPr>
-          <w:sz w:val="18"/>
-          <w:szCs w:val="22"/>
-        </w:rPr>
-        <w:t>Day 6: Numbers 25–29</w:t>
-      </w:r>
-    </w:p>
-    <w:p>
-      <w:pPr>
-        <w:pStyle w:val="Compact"/>
-        <w:numPr>
-          <w:ilvl w:val="0"/>
-          <w:numId w:val="1"/>
-        </w:numPr>
-        <w:rPr>
-          <w:sz w:val="18"/>
-          <w:szCs w:val="22"/>
-        </w:rPr>
-      </w:pPr>
-      <w:r>
-        <w:rPr>
-          <w:sz w:val="18"/>
-          <w:szCs w:val="22"/>
-        </w:rPr>
-        <w:t>Day 7: Numbers 30–33</w:t>
-      </w:r>
-    </w:p>
-    <w:p>
-      <w:pPr>
-        <w:pStyle w:val="Compact"/>
-        <w:numPr>
-          <w:ilvl w:val="0"/>
-          <w:numId w:val="1"/>
-        </w:numPr>
-        <w:rPr>
-          <w:sz w:val="18"/>
-          <w:szCs w:val="22"/>
-        </w:rPr>
-      </w:pPr>
-      <w:r>
-        <w:rPr>
-          <w:sz w:val="18"/>
-          <w:szCs w:val="22"/>
-        </w:rPr>
-        <w:t>Day 8: Numbers 34–36</w:t>
-      </w:r>
-    </w:p>
-    <w:p>
-      <w:pPr>
-        <w:pStyle w:val="Heading2"/>
-      </w:pPr>
-      <w:bookmarkStart w:id="7" w:name="deuteronomy"/>
-      <w:bookmarkEnd w:id="6"/>
-      <w:r>
-        <w:t>Deuteronomy</w:t>
-      </w:r>
-    </w:p>
-    <w:p>
-      <w:pPr>
-        <w:pStyle w:val="Compact"/>
-        <w:numPr>
-          <w:ilvl w:val="0"/>
-          <w:numId w:val="1"/>
-        </w:numPr>
-        <w:rPr>
-          <w:sz w:val="18"/>
-          <w:szCs w:val="22"/>
-        </w:rPr>
-      </w:pPr>
-      <w:r>
-        <w:rPr>
-          <w:sz w:val="18"/>
-          <w:szCs w:val="22"/>
-        </w:rPr>
-        <w:t>Day 1: Deuteronomy 1–5</w:t>
-      </w:r>
-    </w:p>
-    <w:p>
-      <w:pPr>
-        <w:pStyle w:val="Compact"/>
-        <w:numPr>
-          <w:ilvl w:val="0"/>
-          <w:numId w:val="1"/>
-        </w:numPr>
-        <w:rPr>
-          <w:sz w:val="18"/>
-          <w:szCs w:val="22"/>
-        </w:rPr>
-      </w:pPr>
-      <w:r>
-        <w:rPr>
-          <w:sz w:val="18"/>
-          <w:szCs w:val="22"/>
-        </w:rPr>
-        <w:t>Day 2: Deuteronomy 6–10</w:t>
-      </w:r>
-    </w:p>
-    <w:p>
-      <w:pPr>
-        <w:pStyle w:val="Compact"/>
-        <w:numPr>
-          <w:ilvl w:val="0"/>
-          <w:numId w:val="1"/>
-        </w:numPr>
-        <w:rPr>
-          <w:sz w:val="18"/>
-          <w:szCs w:val="22"/>
-        </w:rPr>
-      </w:pPr>
-      <w:r>
-        <w:rPr>
-          <w:sz w:val="18"/>
-          <w:szCs w:val="22"/>
-        </w:rPr>
-        <w:t>Day 3: Deuteronomy 11–15</w:t>
-      </w:r>
-    </w:p>
-    <w:p>
-      <w:pPr>
-        <w:pStyle w:val="Compact"/>
-        <w:numPr>
-          <w:ilvl w:val="0"/>
-          <w:numId w:val="1"/>
-        </w:numPr>
-        <w:rPr>
-          <w:sz w:val="18"/>
-          <w:szCs w:val="22"/>
-        </w:rPr>
-      </w:pPr>
-      <w:r>
-        <w:rPr>
-          <w:sz w:val="18"/>
-          <w:szCs w:val="22"/>
-        </w:rPr>
-        <w:t>Day 4: Deuteronomy 16–20</w:t>
-      </w:r>
-    </w:p>
-    <w:p>
-      <w:pPr>
-        <w:pStyle w:val="Compact"/>
-        <w:numPr>
-          <w:ilvl w:val="0"/>
-          <w:numId w:val="1"/>
-        </w:numPr>
-        <w:rPr>
-          <w:sz w:val="18"/>
-          <w:szCs w:val="22"/>
-        </w:rPr>
-      </w:pPr>
-      <w:r>
-        <w:rPr>
-          <w:sz w:val="18"/>
-          <w:szCs w:val="22"/>
-        </w:rPr>
-        <w:t>Day 5: Deuteronomy 21–25</w:t>
-      </w:r>
-    </w:p>
-    <w:p>
-      <w:pPr>
-        <w:pStyle w:val="Compact"/>
-        <w:numPr>
-          <w:ilvl w:val="0"/>
-          <w:numId w:val="1"/>
-        </w:numPr>
-        <w:rPr>
-          <w:sz w:val="18"/>
-          <w:szCs w:val="22"/>
-        </w:rPr>
-      </w:pPr>
-      <w:r>
-        <w:rPr>
-          <w:sz w:val="18"/>
-          <w:szCs w:val="22"/>
-        </w:rPr>
-        <w:t>Day 6: Deuteronomy 26–30</w:t>
-      </w:r>
-    </w:p>
-    <w:p>
-      <w:pPr>
-        <w:pStyle w:val="Compact"/>
-        <w:numPr>
-          <w:ilvl w:val="0"/>
-          <w:numId w:val="1"/>
-        </w:numPr>
-        <w:rPr>
-          <w:sz w:val="18"/>
-          <w:szCs w:val="22"/>
-        </w:rPr>
-      </w:pPr>
-      <w:r>
         <w:rPr>
           <w:sz w:val="18"/>
           <w:szCs w:val="22"/>
@@ -981,8 +984,8 @@
       <w:pPr>
         <w:pStyle w:val="Heading2"/>
       </w:pPr>
-      <w:bookmarkStart w:id="8" w:name="psalms-13"/>
-      <w:bookmarkEnd w:id="7"/>
+      <w:bookmarkStart w:id="10" w:name="psalms-13"/>
+      <w:bookmarkEnd w:id="8"/>
       <w:r>
         <w:t>Psalms</w:t>
       </w:r>
@@ -1126,13 +1129,13 @@
         </w:rPr>
         <w:t>Day 9: Psalm 119</w:t>
       </w:r>
-      <w:bookmarkEnd w:id="8"/>
-    </w:p>
-    <w:p>
-      <w:pPr>
-        <w:pStyle w:val="Heading2"/>
-      </w:pPr>
-      <w:bookmarkStart w:id="9" w:name="hebrews"/>
+      <w:bookmarkEnd w:id="10"/>
+    </w:p>
+    <w:p>
+      <w:pPr>
+        <w:pStyle w:val="Heading2"/>
+      </w:pPr>
+      <w:bookmarkStart w:id="11" w:name="hebrews"/>
       <w:r>
         <w:t>Hebrews</w:t>
       </w:r>
@@ -1197,57 +1200,58 @@
         <w:t>Day 3: Hebrews 9–13</w:t>
       </w:r>
     </w:p>
+    <w:bookmarkEnd w:id="11"/>
+    <w:p>
+      <w:pPr>
+        <w:pStyle w:val="Heading2"/>
+      </w:pPr>
+      <w:r>
+        <w:t>Galatians</w:t>
+      </w:r>
+    </w:p>
+    <w:p>
+      <w:pPr>
+        <w:pStyle w:val="Compact"/>
+        <w:numPr>
+          <w:ilvl w:val="0"/>
+          <w:numId w:val="1"/>
+        </w:numPr>
+        <w:rPr>
+          <w:sz w:val="18"/>
+          <w:szCs w:val="22"/>
+        </w:rPr>
+      </w:pPr>
+      <w:r>
+        <w:rPr>
+          <w:sz w:val="18"/>
+          <w:szCs w:val="22"/>
+        </w:rPr>
+        <w:t>Day 1: Galatians 1–3</w:t>
+      </w:r>
+    </w:p>
+    <w:p>
+      <w:pPr>
+        <w:pStyle w:val="Compact"/>
+        <w:numPr>
+          <w:ilvl w:val="0"/>
+          <w:numId w:val="1"/>
+        </w:numPr>
+        <w:rPr>
+          <w:sz w:val="18"/>
+          <w:szCs w:val="22"/>
+        </w:rPr>
+      </w:pPr>
+      <w:r>
+        <w:rPr>
+          <w:sz w:val="18"/>
+          <w:szCs w:val="22"/>
+        </w:rPr>
+        <w:t>Day 2: Galatians 4–6</w:t>
+      </w:r>
+    </w:p>
     <w:bookmarkEnd w:id="9"/>
     <w:p>
       <w:pPr>
-        <w:pStyle w:val="Heading2"/>
-      </w:pPr>
-      <w:r>
-        <w:t>Galatians</w:t>
-      </w:r>
-    </w:p>
-    <w:p>
-      <w:pPr>
-        <w:pStyle w:val="Compact"/>
-        <w:numPr>
-          <w:ilvl w:val="0"/>
-          <w:numId w:val="1"/>
-        </w:numPr>
-        <w:rPr>
-          <w:sz w:val="18"/>
-          <w:szCs w:val="22"/>
-        </w:rPr>
-      </w:pPr>
-      <w:r>
-        <w:rPr>
-          <w:sz w:val="18"/>
-          <w:szCs w:val="22"/>
-        </w:rPr>
-        <w:t>Day 1: Galatians 1–3</w:t>
-      </w:r>
-    </w:p>
-    <w:p>
-      <w:pPr>
-        <w:pStyle w:val="Compact"/>
-        <w:numPr>
-          <w:ilvl w:val="0"/>
-          <w:numId w:val="1"/>
-        </w:numPr>
-        <w:rPr>
-          <w:sz w:val="18"/>
-          <w:szCs w:val="22"/>
-        </w:rPr>
-      </w:pPr>
-      <w:r>
-        <w:rPr>
-          <w:sz w:val="18"/>
-          <w:szCs w:val="22"/>
-        </w:rPr>
-        <w:t>Day 2: Galatians 4–6</w:t>
-      </w:r>
-    </w:p>
-    <w:p>
-      <w:pPr>
         <w:pStyle w:val="Heading1"/>
       </w:pPr>
       <w:r>
@@ -1261,7 +1265,8 @@
       <w:pPr>
         <w:pStyle w:val="Heading2"/>
       </w:pPr>
-      <w:bookmarkStart w:id="10" w:name="joshua"/>
+      <w:bookmarkStart w:id="12" w:name="joshua"/>
+      <w:bookmarkStart w:id="13" w:name="_Hlk217317468"/>
       <w:r>
         <w:t>Joshua</w:t>
       </w:r>
@@ -1370,8 +1375,8 @@
       <w:pPr>
         <w:pStyle w:val="Heading2"/>
       </w:pPr>
-      <w:bookmarkStart w:id="11" w:name="psalms-14"/>
-      <w:bookmarkEnd w:id="10"/>
+      <w:bookmarkStart w:id="14" w:name="psalms-14"/>
+      <w:bookmarkEnd w:id="12"/>
       <w:r>
         <w:t>Psalms</w:t>
       </w:r>
@@ -1400,8 +1405,8 @@
       <w:pPr>
         <w:pStyle w:val="Heading2"/>
       </w:pPr>
-      <w:bookmarkStart w:id="12" w:name="ephesians"/>
-      <w:bookmarkEnd w:id="11"/>
+      <w:bookmarkStart w:id="15" w:name="ephesians"/>
+      <w:bookmarkEnd w:id="14"/>
       <w:r>
         <w:t>Ephesians</w:t>
       </w:r>
@@ -1425,8 +1430,9 @@
         </w:rPr>
         <w:t>Day 1: Ephesians 1–6</w:t>
       </w:r>
-      <w:bookmarkEnd w:id="12"/>
-    </w:p>
+      <w:bookmarkEnd w:id="15"/>
+    </w:p>
+    <w:bookmarkEnd w:id="13"/>
     <w:p>
       <w:pPr>
         <w:pStyle w:val="Compact"/>
@@ -1440,7 +1446,7 @@
       <w:pPr>
         <w:pStyle w:val="Heading1"/>
       </w:pPr>
-      <w:bookmarkStart w:id="13" w:name="conquest-1"/>
+      <w:bookmarkStart w:id="16" w:name="conquest-1"/>
       <w:bookmarkEnd w:id="3"/>
       <w:r>
         <w:t>4. Judges Era</w:t>
@@ -1450,7 +1456,8 @@
       <w:pPr>
         <w:pStyle w:val="Heading2"/>
       </w:pPr>
-      <w:bookmarkStart w:id="14" w:name="judges"/>
+      <w:bookmarkStart w:id="17" w:name="judges"/>
+      <w:bookmarkStart w:id="18" w:name="_Hlk217317492"/>
       <w:r>
         <w:t>Judges</w:t>
       </w:r>
@@ -1539,8 +1546,8 @@
       <w:pPr>
         <w:pStyle w:val="Heading2"/>
       </w:pPr>
-      <w:bookmarkStart w:id="15" w:name="ruth"/>
-      <w:bookmarkEnd w:id="14"/>
+      <w:bookmarkStart w:id="19" w:name="ruth"/>
+      <w:bookmarkEnd w:id="17"/>
       <w:r>
         <w:t>Ruth</w:t>
       </w:r>
@@ -1569,8 +1576,8 @@
       <w:pPr>
         <w:pStyle w:val="Heading2"/>
       </w:pPr>
-      <w:bookmarkStart w:id="16" w:name="psalms-15"/>
-      <w:bookmarkEnd w:id="15"/>
+      <w:bookmarkStart w:id="20" w:name="psalms-15"/>
+      <w:bookmarkEnd w:id="19"/>
       <w:r>
         <w:t>Psalms</w:t>
       </w:r>
@@ -1619,8 +1626,8 @@
       <w:pPr>
         <w:pStyle w:val="Heading2"/>
       </w:pPr>
-      <w:bookmarkStart w:id="17" w:name="jude"/>
-      <w:bookmarkEnd w:id="16"/>
+      <w:bookmarkStart w:id="21" w:name="jude"/>
+      <w:bookmarkEnd w:id="20"/>
       <w:r>
         <w:t>Jude</w:t>
       </w:r>
@@ -1649,8 +1656,8 @@
       <w:pPr>
         <w:pStyle w:val="Heading2"/>
       </w:pPr>
-      <w:bookmarkStart w:id="18" w:name="philemon"/>
-      <w:bookmarkEnd w:id="17"/>
+      <w:bookmarkStart w:id="22" w:name="philemon"/>
+      <w:bookmarkEnd w:id="21"/>
       <w:r>
         <w:t>Philemon</w:t>
       </w:r>
@@ -1674,8 +1681,9 @@
         </w:rPr>
         <w:t>Day 1: Philemon 1</w:t>
       </w:r>
-      <w:bookmarkEnd w:id="18"/>
-    </w:p>
+      <w:bookmarkEnd w:id="22"/>
+    </w:p>
+    <w:bookmarkEnd w:id="18"/>
     <w:p>
       <w:pPr>
         <w:pStyle w:val="Heading1"/>
@@ -1691,7 +1699,8 @@
       <w:pPr>
         <w:pStyle w:val="Heading2"/>
       </w:pPr>
-      <w:bookmarkStart w:id="19" w:name="samuel"/>
+      <w:bookmarkStart w:id="23" w:name="samuel"/>
+      <w:bookmarkStart w:id="24" w:name="_Hlk217317624"/>
       <w:r>
         <w:t>1 Samuel</w:t>
       </w:r>
@@ -1821,8 +1830,8 @@
       <w:pPr>
         <w:pStyle w:val="Heading2"/>
       </w:pPr>
-      <w:bookmarkStart w:id="20" w:name="samuel-1"/>
-      <w:bookmarkEnd w:id="19"/>
+      <w:bookmarkStart w:id="25" w:name="samuel-1"/>
+      <w:bookmarkEnd w:id="23"/>
       <w:r>
         <w:t>2 Samuel</w:t>
       </w:r>
@@ -1931,8 +1940,8 @@
       <w:pPr>
         <w:pStyle w:val="Heading2"/>
       </w:pPr>
-      <w:bookmarkStart w:id="21" w:name="psalms-16"/>
-      <w:bookmarkEnd w:id="20"/>
+      <w:bookmarkStart w:id="26" w:name="psalms-16"/>
+      <w:bookmarkEnd w:id="25"/>
       <w:r>
         <w:t>Psalms</w:t>
       </w:r>
@@ -2041,8 +2050,8 @@
       <w:pPr>
         <w:pStyle w:val="Heading2"/>
       </w:pPr>
-      <w:bookmarkStart w:id="22" w:name="mark"/>
-      <w:bookmarkEnd w:id="21"/>
+      <w:bookmarkStart w:id="27" w:name="mark"/>
+      <w:bookmarkEnd w:id="26"/>
       <w:r>
         <w:t>Mark</w:t>
       </w:r>
@@ -2131,8 +2140,8 @@
       <w:pPr>
         <w:pStyle w:val="Heading2"/>
       </w:pPr>
-      <w:bookmarkStart w:id="23" w:name="timothy"/>
-      <w:bookmarkEnd w:id="22"/>
+      <w:bookmarkStart w:id="28" w:name="timothy"/>
+      <w:bookmarkEnd w:id="27"/>
       <w:r>
         <w:t>1 Timothy</w:t>
       </w:r>
@@ -2181,8 +2190,8 @@
       <w:pPr>
         <w:pStyle w:val="Heading2"/>
       </w:pPr>
-      <w:bookmarkStart w:id="24" w:name="titus"/>
-      <w:bookmarkEnd w:id="23"/>
+      <w:bookmarkStart w:id="29" w:name="titus"/>
+      <w:bookmarkEnd w:id="28"/>
       <w:r>
         <w:t>Titus</w:t>
       </w:r>
@@ -2206,8 +2215,9 @@
         </w:rPr>
         <w:t>Day 1: Titus 1–3</w:t>
       </w:r>
-      <w:bookmarkEnd w:id="24"/>
-    </w:p>
+      <w:bookmarkEnd w:id="29"/>
+    </w:p>
+    <w:bookmarkEnd w:id="24"/>
     <w:p>
       <w:pPr>
         <w:pStyle w:val="Heading1"/>
@@ -2223,7 +2233,8 @@
       <w:pPr>
         <w:pStyle w:val="Heading2"/>
       </w:pPr>
-      <w:bookmarkStart w:id="25" w:name="kings"/>
+      <w:bookmarkStart w:id="30" w:name="kings"/>
+      <w:bookmarkStart w:id="31" w:name="_Hlk217317748"/>
       <w:r>
         <w:t>1 Kings</w:t>
       </w:r>
@@ -2312,8 +2323,8 @@
       <w:pPr>
         <w:pStyle w:val="Heading2"/>
       </w:pPr>
-      <w:bookmarkStart w:id="26" w:name="chronicles"/>
-      <w:bookmarkEnd w:id="25"/>
+      <w:bookmarkStart w:id="32" w:name="chronicles"/>
+      <w:bookmarkEnd w:id="30"/>
       <w:r>
         <w:t>1 Chronicles</w:t>
       </w:r>
@@ -2422,8 +2433,8 @@
       <w:pPr>
         <w:pStyle w:val="Heading2"/>
       </w:pPr>
-      <w:bookmarkStart w:id="27" w:name="psalms-17"/>
-      <w:bookmarkEnd w:id="26"/>
+      <w:bookmarkStart w:id="33" w:name="psalms-17"/>
+      <w:bookmarkEnd w:id="32"/>
       <w:r>
         <w:t>Psalms</w:t>
       </w:r>
@@ -2472,8 +2483,8 @@
       <w:pPr>
         <w:pStyle w:val="Heading2"/>
       </w:pPr>
-      <w:bookmarkStart w:id="28" w:name="corinthians"/>
-      <w:bookmarkEnd w:id="27"/>
+      <w:bookmarkStart w:id="34" w:name="corinthians"/>
+      <w:bookmarkEnd w:id="33"/>
       <w:r>
         <w:t>1 Corinthians</w:t>
       </w:r>
@@ -2557,14 +2568,15 @@
         </w:rPr>
         <w:t>Day 4: 1 Corinthians 13–16</w:t>
       </w:r>
-      <w:bookmarkEnd w:id="28"/>
+      <w:bookmarkEnd w:id="34"/>
     </w:p>
     <w:p>
       <w:pPr>
         <w:pStyle w:val="Heading1"/>
       </w:pPr>
-      <w:bookmarkStart w:id="29" w:name="late-divided-monarchy-fall-1"/>
-      <w:bookmarkEnd w:id="13"/>
+      <w:bookmarkStart w:id="35" w:name="late-divided-monarchy-fall-1"/>
+      <w:bookmarkEnd w:id="16"/>
+      <w:bookmarkEnd w:id="31"/>
       <w:r>
         <w:t xml:space="preserve">7. Late Divided </w:t>
       </w:r>
@@ -2579,7 +2591,8 @@
       <w:pPr>
         <w:pStyle w:val="Heading2"/>
       </w:pPr>
-      <w:bookmarkStart w:id="30" w:name="kings-1"/>
+      <w:bookmarkStart w:id="36" w:name="kings-1"/>
+      <w:bookmarkStart w:id="37" w:name="_Hlk217317843"/>
       <w:r>
         <w:t>2 Kings</w:t>
       </w:r>
@@ -2688,8 +2701,8 @@
       <w:pPr>
         <w:pStyle w:val="Heading2"/>
       </w:pPr>
-      <w:bookmarkStart w:id="31" w:name="chronicles-1"/>
-      <w:bookmarkEnd w:id="30"/>
+      <w:bookmarkStart w:id="38" w:name="chronicles-1"/>
+      <w:bookmarkEnd w:id="36"/>
       <w:r>
         <w:t>2 Chronicles</w:t>
       </w:r>
@@ -2838,8 +2851,8 @@
       <w:pPr>
         <w:pStyle w:val="Heading2"/>
       </w:pPr>
-      <w:bookmarkStart w:id="32" w:name="amos"/>
-      <w:bookmarkEnd w:id="31"/>
+      <w:bookmarkStart w:id="39" w:name="amos"/>
+      <w:bookmarkEnd w:id="38"/>
       <w:r>
         <w:t>Amos</w:t>
       </w:r>
@@ -2888,8 +2901,8 @@
       <w:pPr>
         <w:pStyle w:val="Heading2"/>
       </w:pPr>
-      <w:bookmarkStart w:id="33" w:name="hosea"/>
-      <w:bookmarkEnd w:id="32"/>
+      <w:bookmarkStart w:id="40" w:name="hosea"/>
+      <w:bookmarkEnd w:id="39"/>
       <w:r>
         <w:t>Hosea</w:t>
       </w:r>
@@ -2958,8 +2971,8 @@
       <w:pPr>
         <w:pStyle w:val="Heading2"/>
       </w:pPr>
-      <w:bookmarkStart w:id="34" w:name="micah"/>
-      <w:bookmarkEnd w:id="33"/>
+      <w:bookmarkStart w:id="41" w:name="micah"/>
+      <w:bookmarkEnd w:id="40"/>
       <w:r>
         <w:t>Micah</w:t>
       </w:r>
@@ -3008,8 +3021,8 @@
       <w:pPr>
         <w:pStyle w:val="Heading2"/>
       </w:pPr>
-      <w:bookmarkStart w:id="35" w:name="jonah"/>
-      <w:bookmarkEnd w:id="34"/>
+      <w:bookmarkStart w:id="42" w:name="jonah"/>
+      <w:bookmarkEnd w:id="41"/>
       <w:r>
         <w:t>Jonah</w:t>
       </w:r>
@@ -3033,16 +3046,16 @@
         </w:rPr>
         <w:t>Day 1: Jonah 1–4</w:t>
       </w:r>
-      <w:bookmarkEnd w:id="35"/>
-    </w:p>
-    <w:p>
-      <w:pPr>
-        <w:pStyle w:val="Heading2"/>
-      </w:pPr>
-      <w:bookmarkStart w:id="36" w:name="nahum"/>
-      <w:bookmarkStart w:id="37" w:name="zephaniah"/>
-      <w:bookmarkStart w:id="38" w:name="habakkuk"/>
-      <w:bookmarkStart w:id="39" w:name="psalms-18"/>
+      <w:bookmarkEnd w:id="42"/>
+    </w:p>
+    <w:p>
+      <w:pPr>
+        <w:pStyle w:val="Heading2"/>
+      </w:pPr>
+      <w:bookmarkStart w:id="43" w:name="nahum"/>
+      <w:bookmarkStart w:id="44" w:name="zephaniah"/>
+      <w:bookmarkStart w:id="45" w:name="habakkuk"/>
+      <w:bookmarkStart w:id="46" w:name="psalms-18"/>
       <w:r>
         <w:t>Nahum</w:t>
       </w:r>
@@ -3066,7 +3079,7 @@
         </w:rPr>
         <w:t>Day 1: Nahum 1–3</w:t>
       </w:r>
-      <w:bookmarkEnd w:id="36"/>
+      <w:bookmarkEnd w:id="43"/>
     </w:p>
     <w:p>
       <w:pPr>
@@ -3100,8 +3113,8 @@
       <w:pPr>
         <w:pStyle w:val="Heading2"/>
       </w:pPr>
-      <w:bookmarkStart w:id="40" w:name="obadiah"/>
-      <w:bookmarkEnd w:id="37"/>
+      <w:bookmarkStart w:id="47" w:name="obadiah"/>
+      <w:bookmarkEnd w:id="44"/>
       <w:r>
         <w:t>Obadiah</w:t>
       </w:r>
@@ -3130,8 +3143,8 @@
       <w:pPr>
         <w:pStyle w:val="Heading2"/>
       </w:pPr>
-      <w:bookmarkStart w:id="41" w:name="joel"/>
-      <w:bookmarkEnd w:id="40"/>
+      <w:bookmarkStart w:id="48" w:name="joel"/>
+      <w:bookmarkEnd w:id="47"/>
       <w:r>
         <w:t>Joel</w:t>
       </w:r>
@@ -3155,7 +3168,7 @@
         </w:rPr>
         <w:t>Day 1: Joel 1–3</w:t>
       </w:r>
-      <w:bookmarkEnd w:id="41"/>
+      <w:bookmarkEnd w:id="48"/>
     </w:p>
     <w:p>
       <w:pPr>
@@ -3165,7 +3178,7 @@
         <w:t>Habakkuk</w:t>
       </w:r>
     </w:p>
-    <w:bookmarkEnd w:id="38"/>
+    <w:bookmarkEnd w:id="45"/>
     <w:p>
       <w:pPr>
         <w:pStyle w:val="Compact"/>
@@ -3258,8 +3271,8 @@
       <w:pPr>
         <w:pStyle w:val="Heading2"/>
       </w:pPr>
-      <w:bookmarkStart w:id="42" w:name="corinthians-1"/>
-      <w:bookmarkEnd w:id="39"/>
+      <w:bookmarkStart w:id="49" w:name="corinthians-1"/>
+      <w:bookmarkEnd w:id="46"/>
       <w:r>
         <w:t>2 Corinthians</w:t>
       </w:r>
@@ -3324,7 +3337,7 @@
         <w:t>Day 3: 2 Corinthians 10–13</w:t>
       </w:r>
     </w:p>
-    <w:bookmarkEnd w:id="42"/>
+    <w:bookmarkEnd w:id="49"/>
     <w:p>
       <w:pPr>
         <w:pStyle w:val="Heading2"/>
@@ -3353,6 +3366,7 @@
         <w:t>Day 1: 2 Peter 1–3</w:t>
       </w:r>
     </w:p>
+    <w:bookmarkEnd w:id="37"/>
     <w:p>
       <w:pPr>
         <w:pStyle w:val="Heading1"/>
@@ -3365,7 +3379,9 @@
       <w:pPr>
         <w:pStyle w:val="Heading2"/>
       </w:pPr>
-      <w:bookmarkStart w:id="43" w:name="jeremiah"/>
+      <w:bookmarkStart w:id="50" w:name="jeremiah"/>
+      <w:bookmarkStart w:id="51" w:name="_Hlk217318220"/>
+      <w:bookmarkStart w:id="52" w:name="_Hlk217318308"/>
       <w:r>
         <w:t>Jeremiah</w:t>
       </w:r>
@@ -3595,8 +3611,8 @@
       <w:pPr>
         <w:pStyle w:val="Heading2"/>
       </w:pPr>
-      <w:bookmarkStart w:id="44" w:name="lamentations"/>
-      <w:bookmarkEnd w:id="43"/>
+      <w:bookmarkStart w:id="53" w:name="lamentations"/>
+      <w:bookmarkEnd w:id="50"/>
       <w:r>
         <w:t>Lamentations</w:t>
       </w:r>
@@ -3625,8 +3641,8 @@
       <w:pPr>
         <w:pStyle w:val="Heading2"/>
       </w:pPr>
-      <w:bookmarkStart w:id="45" w:name="ezekiel"/>
-      <w:bookmarkEnd w:id="44"/>
+      <w:bookmarkStart w:id="54" w:name="ezekiel"/>
+      <w:bookmarkEnd w:id="53"/>
       <w:r>
         <w:t>Ezekiel</w:t>
       </w:r>
@@ -3835,8 +3851,8 @@
       <w:pPr>
         <w:pStyle w:val="Heading2"/>
       </w:pPr>
-      <w:bookmarkStart w:id="46" w:name="psalms-19"/>
-      <w:bookmarkEnd w:id="45"/>
+      <w:bookmarkStart w:id="55" w:name="psalms-19"/>
+      <w:bookmarkEnd w:id="54"/>
       <w:r>
         <w:t>Psalms</w:t>
       </w:r>
@@ -3865,8 +3881,8 @@
       <w:pPr>
         <w:pStyle w:val="Heading2"/>
       </w:pPr>
-      <w:bookmarkStart w:id="47" w:name="colossians"/>
-      <w:bookmarkEnd w:id="46"/>
+      <w:bookmarkStart w:id="56" w:name="colossians"/>
+      <w:bookmarkEnd w:id="55"/>
       <w:r>
         <w:t>Colossians</w:t>
       </w:r>
@@ -3895,8 +3911,8 @@
       <w:pPr>
         <w:pStyle w:val="Heading2"/>
       </w:pPr>
-      <w:bookmarkStart w:id="48" w:name="timothy-1"/>
-      <w:bookmarkEnd w:id="47"/>
+      <w:bookmarkStart w:id="57" w:name="timothy-1"/>
+      <w:bookmarkEnd w:id="56"/>
       <w:r>
         <w:t>2 Timothy</w:t>
       </w:r>
@@ -3920,8 +3936,10 @@
         </w:rPr>
         <w:t>Day 1: 2 Timothy 1–4</w:t>
       </w:r>
-      <w:bookmarkEnd w:id="48"/>
-    </w:p>
+      <w:bookmarkEnd w:id="51"/>
+      <w:bookmarkEnd w:id="57"/>
+    </w:p>
+    <w:bookmarkEnd w:id="52"/>
     <w:p>
       <w:pPr>
         <w:pStyle w:val="Heading1"/>
@@ -3940,7 +3958,8 @@
       <w:pPr>
         <w:pStyle w:val="Heading2"/>
       </w:pPr>
-      <w:bookmarkStart w:id="49" w:name="isaiah"/>
+      <w:bookmarkStart w:id="58" w:name="isaiah"/>
+      <w:bookmarkStart w:id="59" w:name="_Hlk217318492"/>
       <w:r>
         <w:t>Isaiah</w:t>
       </w:r>
@@ -4213,8 +4232,8 @@
           <w:szCs w:val="28"/>
         </w:rPr>
       </w:pPr>
-      <w:bookmarkStart w:id="50" w:name="psalms-20"/>
-      <w:bookmarkEnd w:id="49"/>
+      <w:bookmarkStart w:id="60" w:name="psalms-20"/>
+      <w:bookmarkEnd w:id="58"/>
       <w:r>
         <w:rPr>
           <w:sz w:val="28"/>
@@ -4247,8 +4266,8 @@
       <w:pPr>
         <w:pStyle w:val="Heading2"/>
       </w:pPr>
-      <w:bookmarkStart w:id="51" w:name="matthew"/>
-      <w:bookmarkEnd w:id="50"/>
+      <w:bookmarkStart w:id="61" w:name="matthew"/>
+      <w:bookmarkEnd w:id="60"/>
       <w:r>
         <w:t>Matthew</w:t>
       </w:r>
@@ -4357,8 +4376,8 @@
       <w:pPr>
         <w:pStyle w:val="Heading2"/>
       </w:pPr>
-      <w:bookmarkStart w:id="52" w:name="romans"/>
-      <w:bookmarkEnd w:id="51"/>
+      <w:bookmarkStart w:id="62" w:name="romans"/>
+      <w:bookmarkEnd w:id="61"/>
       <w:r>
         <w:t>Romans</w:t>
       </w:r>
@@ -4447,8 +4466,8 @@
       <w:pPr>
         <w:pStyle w:val="Heading2"/>
       </w:pPr>
-      <w:bookmarkStart w:id="53" w:name="peter-1"/>
-      <w:bookmarkEnd w:id="52"/>
+      <w:bookmarkStart w:id="63" w:name="peter-1"/>
+      <w:bookmarkEnd w:id="62"/>
       <w:r>
         <w:t>1 Peter</w:t>
       </w:r>
@@ -4472,14 +4491,15 @@
         </w:rPr>
         <w:t>Day 1: 1 Peter 1–5</w:t>
       </w:r>
-      <w:bookmarkEnd w:id="53"/>
+      <w:bookmarkEnd w:id="63"/>
     </w:p>
     <w:p>
       <w:pPr>
         <w:pStyle w:val="Heading1"/>
       </w:pPr>
-      <w:bookmarkStart w:id="54" w:name="isaiah-bridge-section-1"/>
-      <w:bookmarkEnd w:id="29"/>
+      <w:bookmarkStart w:id="64" w:name="isaiah-bridge-section-1"/>
+      <w:bookmarkEnd w:id="35"/>
+      <w:bookmarkEnd w:id="59"/>
       <w:r>
         <w:t>10. Return &amp; Restoration</w:t>
       </w:r>
@@ -4488,7 +4508,8 @@
       <w:pPr>
         <w:pStyle w:val="Heading2"/>
       </w:pPr>
-      <w:bookmarkStart w:id="55" w:name="ezra"/>
+      <w:bookmarkStart w:id="65" w:name="ezra"/>
+      <w:bookmarkStart w:id="66" w:name="_Hlk217318569"/>
       <w:r>
         <w:t>Ezra</w:t>
       </w:r>
@@ -4537,8 +4558,8 @@
       <w:pPr>
         <w:pStyle w:val="Heading2"/>
       </w:pPr>
-      <w:bookmarkStart w:id="56" w:name="nehemiah"/>
-      <w:bookmarkEnd w:id="55"/>
+      <w:bookmarkStart w:id="67" w:name="nehemiah"/>
+      <w:bookmarkEnd w:id="65"/>
       <w:r>
         <w:t>Nehemiah</w:t>
       </w:r>
@@ -4607,8 +4628,8 @@
       <w:pPr>
         <w:pStyle w:val="Heading2"/>
       </w:pPr>
-      <w:bookmarkStart w:id="57" w:name="ester"/>
-      <w:bookmarkEnd w:id="56"/>
+      <w:bookmarkStart w:id="68" w:name="ester"/>
+      <w:bookmarkEnd w:id="67"/>
       <w:r>
         <w:t>Ester</w:t>
       </w:r>
@@ -4657,8 +4678,8 @@
       <w:pPr>
         <w:pStyle w:val="Heading2"/>
       </w:pPr>
-      <w:bookmarkStart w:id="58" w:name="haggai"/>
-      <w:bookmarkEnd w:id="57"/>
+      <w:bookmarkStart w:id="69" w:name="haggai"/>
+      <w:bookmarkEnd w:id="68"/>
       <w:r>
         <w:t>Haggai</w:t>
       </w:r>
@@ -4687,8 +4708,8 @@
       <w:pPr>
         <w:pStyle w:val="Heading2"/>
       </w:pPr>
-      <w:bookmarkStart w:id="59" w:name="malachi"/>
-      <w:bookmarkEnd w:id="58"/>
+      <w:bookmarkStart w:id="70" w:name="malachi"/>
+      <w:bookmarkEnd w:id="69"/>
       <w:r>
         <w:t>Malachi</w:t>
       </w:r>
@@ -4717,8 +4738,8 @@
       <w:pPr>
         <w:pStyle w:val="Heading2"/>
       </w:pPr>
-      <w:bookmarkStart w:id="60" w:name="psalms-21"/>
-      <w:bookmarkEnd w:id="59"/>
+      <w:bookmarkStart w:id="71" w:name="psalms-21"/>
+      <w:bookmarkEnd w:id="70"/>
       <w:r>
         <w:t>Psalms</w:t>
       </w:r>
@@ -4767,8 +4788,8 @@
       <w:pPr>
         <w:pStyle w:val="Heading2"/>
       </w:pPr>
-      <w:bookmarkStart w:id="61" w:name="luke"/>
-      <w:bookmarkEnd w:id="60"/>
+      <w:bookmarkStart w:id="72" w:name="luke"/>
+      <w:bookmarkEnd w:id="71"/>
       <w:r>
         <w:t>Luke</w:t>
       </w:r>
@@ -4877,8 +4898,8 @@
       <w:pPr>
         <w:pStyle w:val="Heading2"/>
       </w:pPr>
-      <w:bookmarkStart w:id="62" w:name="philippians"/>
-      <w:bookmarkEnd w:id="61"/>
+      <w:bookmarkStart w:id="73" w:name="philippians"/>
+      <w:bookmarkEnd w:id="72"/>
       <w:r>
         <w:t>Philippians</w:t>
       </w:r>
@@ -4907,8 +4928,8 @@
       <w:pPr>
         <w:pStyle w:val="Heading2"/>
       </w:pPr>
-      <w:bookmarkStart w:id="63" w:name="john-1"/>
-      <w:bookmarkEnd w:id="62"/>
+      <w:bookmarkStart w:id="74" w:name="john-1"/>
+      <w:bookmarkEnd w:id="73"/>
       <w:r>
         <w:t>2 John</w:t>
       </w:r>
@@ -4937,8 +4958,8 @@
       <w:pPr>
         <w:pStyle w:val="Heading2"/>
       </w:pPr>
-      <w:bookmarkStart w:id="64" w:name="john-2"/>
-      <w:bookmarkEnd w:id="63"/>
+      <w:bookmarkStart w:id="75" w:name="john-2"/>
+      <w:bookmarkEnd w:id="74"/>
       <w:r>
         <w:t>3 John</w:t>
       </w:r>
@@ -4967,8 +4988,8 @@
       <w:pPr>
         <w:pStyle w:val="Heading2"/>
       </w:pPr>
-      <w:bookmarkStart w:id="65" w:name="acts"/>
-      <w:bookmarkEnd w:id="64"/>
+      <w:bookmarkStart w:id="76" w:name="acts"/>
+      <w:bookmarkEnd w:id="75"/>
       <w:r>
         <w:t>Acts</w:t>
       </w:r>
@@ -5092,13 +5113,14 @@
         </w:rPr>
         <w:t>Day 6: Acts 25–28</w:t>
       </w:r>
-      <w:bookmarkEnd w:id="65"/>
+      <w:bookmarkEnd w:id="76"/>
     </w:p>
     <w:p>
       <w:pPr>
         <w:pStyle w:val="Heading1"/>
       </w:pPr>
-      <w:bookmarkStart w:id="66" w:name="wisdom-worship-1"/>
+      <w:bookmarkStart w:id="77" w:name="wisdom-worship-1"/>
+      <w:bookmarkEnd w:id="66"/>
       <w:r>
         <w:t xml:space="preserve">11. Wisdom &amp; </w:t>
       </w:r>
@@ -5110,7 +5132,8 @@
       <w:pPr>
         <w:pStyle w:val="Heading2"/>
       </w:pPr>
-      <w:bookmarkStart w:id="67" w:name="job"/>
+      <w:bookmarkStart w:id="78" w:name="job"/>
+      <w:bookmarkStart w:id="79" w:name="_Hlk217318819"/>
       <w:r>
         <w:t>Job</w:t>
       </w:r>
@@ -5279,8 +5302,8 @@
       <w:pPr>
         <w:pStyle w:val="Heading2"/>
       </w:pPr>
-      <w:bookmarkStart w:id="68" w:name="proverbs"/>
-      <w:bookmarkEnd w:id="67"/>
+      <w:bookmarkStart w:id="80" w:name="proverbs"/>
+      <w:bookmarkEnd w:id="78"/>
       <w:r>
         <w:t>Proverbs</w:t>
       </w:r>
@@ -5410,8 +5433,8 @@
       <w:pPr>
         <w:pStyle w:val="Heading2"/>
       </w:pPr>
-      <w:bookmarkStart w:id="69" w:name="ecclesiastes"/>
-      <w:bookmarkEnd w:id="68"/>
+      <w:bookmarkStart w:id="81" w:name="ecclesiastes"/>
+      <w:bookmarkEnd w:id="80"/>
       <w:r>
         <w:t>Ecclesiastes</w:t>
       </w:r>
@@ -5480,8 +5503,8 @@
       <w:pPr>
         <w:pStyle w:val="Heading2"/>
       </w:pPr>
-      <w:bookmarkStart w:id="70" w:name="song-of-songs"/>
-      <w:bookmarkEnd w:id="69"/>
+      <w:bookmarkStart w:id="82" w:name="song-of-songs"/>
+      <w:bookmarkEnd w:id="81"/>
       <w:r>
         <w:t>Song of Songs</w:t>
       </w:r>
@@ -5530,8 +5553,8 @@
       <w:pPr>
         <w:pStyle w:val="Heading2"/>
       </w:pPr>
-      <w:bookmarkStart w:id="71" w:name="psalms-22"/>
-      <w:bookmarkEnd w:id="70"/>
+      <w:bookmarkStart w:id="83" w:name="psalms-22"/>
+      <w:bookmarkEnd w:id="82"/>
       <w:r>
         <w:t>Psalms</w:t>
       </w:r>
@@ -5560,8 +5583,8 @@
       <w:pPr>
         <w:pStyle w:val="Heading2"/>
       </w:pPr>
-      <w:bookmarkStart w:id="72" w:name="john-3"/>
-      <w:bookmarkEnd w:id="71"/>
+      <w:bookmarkStart w:id="84" w:name="john-3"/>
+      <w:bookmarkEnd w:id="83"/>
       <w:r>
         <w:t>1 John</w:t>
       </w:r>
@@ -5590,8 +5613,8 @@
       <w:pPr>
         <w:pStyle w:val="Heading2"/>
       </w:pPr>
-      <w:bookmarkStart w:id="73" w:name="james"/>
-      <w:bookmarkEnd w:id="72"/>
+      <w:bookmarkStart w:id="85" w:name="james"/>
+      <w:bookmarkEnd w:id="84"/>
       <w:r>
         <w:t>James</w:t>
       </w:r>
@@ -5615,15 +5638,16 @@
         </w:rPr>
         <w:t>Day 1: James 1–5</w:t>
       </w:r>
-      <w:bookmarkEnd w:id="66"/>
-      <w:bookmarkEnd w:id="73"/>
+      <w:bookmarkEnd w:id="77"/>
+      <w:bookmarkEnd w:id="85"/>
     </w:p>
     <w:p>
       <w:pPr>
         <w:pStyle w:val="Heading1"/>
       </w:pPr>
-      <w:bookmarkStart w:id="74" w:name="prophetic-visions-new-creation-1"/>
-      <w:bookmarkEnd w:id="54"/>
+      <w:bookmarkStart w:id="86" w:name="prophetic-visions-new-creation-1"/>
+      <w:bookmarkEnd w:id="64"/>
+      <w:bookmarkEnd w:id="79"/>
       <w:r>
         <w:t xml:space="preserve">12. Prophetic Visions &amp; </w:t>
       </w:r>
@@ -5638,7 +5662,8 @@
       <w:pPr>
         <w:pStyle w:val="Heading2"/>
       </w:pPr>
-      <w:bookmarkStart w:id="75" w:name="zechariah"/>
+      <w:bookmarkStart w:id="87" w:name="zechariah"/>
+      <w:bookmarkStart w:id="88" w:name="_Hlk217319170"/>
       <w:r>
         <w:t>Zechariah</w:t>
       </w:r>
@@ -5707,8 +5732,8 @@
       <w:pPr>
         <w:pStyle w:val="Heading2"/>
       </w:pPr>
-      <w:bookmarkStart w:id="76" w:name="daniel"/>
-      <w:bookmarkEnd w:id="75"/>
+      <w:bookmarkStart w:id="89" w:name="daniel"/>
+      <w:bookmarkEnd w:id="87"/>
       <w:r>
         <w:t>Daniel</w:t>
       </w:r>
@@ -5777,8 +5802,8 @@
       <w:pPr>
         <w:pStyle w:val="Heading2"/>
       </w:pPr>
-      <w:bookmarkStart w:id="77" w:name="psalms-23"/>
-      <w:bookmarkEnd w:id="76"/>
+      <w:bookmarkStart w:id="90" w:name="psalms-23"/>
+      <w:bookmarkEnd w:id="89"/>
       <w:r>
         <w:t>Psalms</w:t>
       </w:r>
@@ -5827,8 +5852,8 @@
       <w:pPr>
         <w:pStyle w:val="Heading2"/>
       </w:pPr>
-      <w:bookmarkStart w:id="78" w:name="revelation"/>
-      <w:bookmarkEnd w:id="77"/>
+      <w:bookmarkStart w:id="91" w:name="revelation"/>
+      <w:bookmarkEnd w:id="90"/>
       <w:r>
         <w:t>Revelation</w:t>
       </w:r>
@@ -5937,8 +5962,8 @@
       <w:pPr>
         <w:pStyle w:val="Heading2"/>
       </w:pPr>
-      <w:bookmarkStart w:id="79" w:name="thessalonians"/>
-      <w:bookmarkEnd w:id="78"/>
+      <w:bookmarkStart w:id="92" w:name="thessalonians"/>
+      <w:bookmarkEnd w:id="91"/>
       <w:r>
         <w:t>1 Thessalonians</w:t>
       </w:r>
@@ -5967,8 +5992,8 @@
       <w:pPr>
         <w:pStyle w:val="Heading2"/>
       </w:pPr>
-      <w:bookmarkStart w:id="80" w:name="thessalonians-1"/>
-      <w:bookmarkEnd w:id="79"/>
+      <w:bookmarkStart w:id="93" w:name="thessalonians-1"/>
+      <w:bookmarkEnd w:id="92"/>
       <w:r>
         <w:t>2 Thessalonians</w:t>
       </w:r>
@@ -5992,9 +6017,10 @@
         </w:rPr>
         <w:t>Day 1: 2 Thessalonians 1–3</w:t>
       </w:r>
-      <w:bookmarkEnd w:id="74"/>
-      <w:bookmarkEnd w:id="80"/>
-    </w:p>
+      <w:bookmarkEnd w:id="86"/>
+      <w:bookmarkEnd w:id="93"/>
+    </w:p>
+    <w:bookmarkEnd w:id="88"/>
     <w:p/>
     <w:sectPr>
       <w:footnotePr>

</xml_diff>